<commit_message>
feat: improve RAG retrieval with rerank and temporal evidence scoring
</commit_message>
<xml_diff>
--- a/docs/CampusAgent项目方案书.docx
+++ b/docs/CampusAgent项目方案书.docx
@@ -11933,11 +11933,6 @@
       </w:r>
     </w:p>
     <w:p>
-      <w:r>
-        <w:br w:type="page"/>
-      </w:r>
-    </w:p>
-    <w:p>
       <w:pPr>
         <w:pStyle w:val="Heading1"/>
       </w:pPr>

</xml_diff>